<commit_message>
docs(hr): update leave policy deadlines (23h59, 2/3 days ahead) and web option
Co-Authored-By: Claude Sonnet 5.5 <noreply@anthropic.com>
</commit_message>
<xml_diff>
--- a/word-export/Quy-dinh-nghi-phep.docx
+++ b/word-export/Quy-dinh-nghi-phep.docx
@@ -1,20 +1,19 @@
 
 <file path=word/document.xml><?xml version="1.0" encoding="utf-8"?>
-<w:document xmlns:wpc="http://schemas.microsoft.com/office/word/2010/wordprocessingCanvas" xmlns:cx="http://schemas.microsoft.com/office/drawing/2014/chartex" xmlns:cx1="http://schemas.microsoft.com/office/drawing/2015/9/8/chartex" xmlns:cx2="http://schemas.microsoft.com/office/drawing/2015/10/21/chartex" xmlns:cx3="http://schemas.microsoft.com/office/drawing/2016/5/9/chartex" xmlns:cx4="http://schemas.microsoft.com/office/drawing/2016/5/10/chartex" xmlns:cx5="http://schemas.microsoft.com/office/drawing/2016/5/11/chartex" xmlns:cx6="http://schemas.microsoft.com/office/drawing/2016/5/12/chartex" xmlns:cx7="http://schemas.microsoft.com/office/drawing/2016/5/13/chartex" xmlns:cx8="http://schemas.microsoft.com/office/drawing/2016/5/14/chartex" xmlns:mc="http://schemas.openxmlformats.org/markup-compatibility/2006" xmlns:aink="http://schemas.microsoft.com/office/drawing/2016/ink" xmlns:am3d="http://schemas.microsoft.com/office/drawing/2017/model3d" xmlns:o="urn:schemas-microsoft-com:office:office" xmlns:r="http://schemas.openxmlformats.org/officeDocument/2006/relationships" xmlns:m="http://schemas.openxmlformats.org/officeDocument/2006/math" xmlns:v="urn:schemas-microsoft-com:vml" xmlns:wp14="http://schemas.microsoft.com/office/word/2010/wordprocessingDrawing" xmlns:wp="http://schemas.openxmlformats.org/drawingml/2006/wordprocessingDrawing" xmlns:w10="urn:schemas-microsoft-com:office:word" xmlns:w="http://schemas.openxmlformats.org/wordprocessingml/2006/main" xmlns:w14="http://schemas.microsoft.com/office/word/2010/wordml" xmlns:w15="http://schemas.microsoft.com/office/word/2012/wordml" xmlns:w16cex="http://schemas.microsoft.com/office/word/2018/wordml/cex" xmlns:w16cid="http://schemas.microsoft.com/office/word/2016/wordml/cid" xmlns:w16="http://schemas.microsoft.com/office/word/2018/wordml" xmlns:w16sdtdh="http://schemas.microsoft.com/office/word/2020/wordml/sdtdatahash" xmlns:w16se="http://schemas.microsoft.com/office/word/2015/wordml/symex" xmlns:wpg="http://schemas.microsoft.com/office/word/2010/wordprocessingGroup" xmlns:wpi="http://schemas.microsoft.com/office/word/2010/wordprocessingInk" xmlns:wne="http://schemas.microsoft.com/office/word/2006/wordml" xmlns:wps="http://schemas.microsoft.com/office/word/2010/wordprocessingShape" mc:Ignorable="w14 w15 w16se w16cid w16 w16cex w16sdtdh wp14">
+<w:document xmlns:wpc="http://schemas.microsoft.com/office/word/2010/wordprocessingCanvas" xmlns:cx="http://schemas.microsoft.com/office/drawing/2014/chartex" xmlns:cx1="http://schemas.microsoft.com/office/drawing/2015/9/8/chartex" xmlns:cx2="http://schemas.microsoft.com/office/drawing/2015/10/21/chartex" xmlns:cx3="http://schemas.microsoft.com/office/drawing/2016/5/9/chartex" xmlns:cx4="http://schemas.microsoft.com/office/drawing/2016/5/10/chartex" xmlns:cx5="http://schemas.microsoft.com/office/drawing/2016/5/11/chartex" xmlns:cx6="http://schemas.microsoft.com/office/drawing/2016/5/12/chartex" xmlns:cx7="http://schemas.microsoft.com/office/drawing/2016/5/13/chartex" xmlns:cx8="http://schemas.microsoft.com/office/drawing/2016/5/14/chartex" xmlns:mc="http://schemas.openxmlformats.org/markup-compatibility/2006" xmlns:aink="http://schemas.microsoft.com/office/drawing/2016/ink" xmlns:am3d="http://schemas.microsoft.com/office/drawing/2017/model3d" xmlns:o="urn:schemas-microsoft-com:office:office" xmlns:oel="http://schemas.microsoft.com/office/2019/extlst" xmlns:r="http://schemas.openxmlformats.org/officeDocument/2006/relationships" xmlns:m="http://schemas.openxmlformats.org/officeDocument/2006/math" xmlns:v="urn:schemas-microsoft-com:vml" xmlns:wp14="http://schemas.microsoft.com/office/word/2010/wordprocessingDrawing" xmlns:wp="http://schemas.openxmlformats.org/drawingml/2006/wordprocessingDrawing" xmlns:w10="urn:schemas-microsoft-com:office:word" xmlns:w="http://schemas.openxmlformats.org/wordprocessingml/2006/main" xmlns:w14="http://schemas.microsoft.com/office/word/2010/wordml" xmlns:w15="http://schemas.microsoft.com/office/word/2012/wordml" xmlns:w16cex="http://schemas.microsoft.com/office/word/2018/wordml/cex" xmlns:w16cid="http://schemas.microsoft.com/office/word/2016/wordml/cid" xmlns:w16="http://schemas.microsoft.com/office/word/2018/wordml" xmlns:w16du="http://schemas.microsoft.com/office/word/2023/wordml/word16du" xmlns:w16sdtdh="http://schemas.microsoft.com/office/word/2020/wordml/sdtdatahash" xmlns:w16sdtfl="http://schemas.microsoft.com/office/word/2024/wordml/sdtformatlock" xmlns:w16se="http://schemas.microsoft.com/office/word/2015/wordml/symex" xmlns:wpg="http://schemas.microsoft.com/office/word/2010/wordprocessingGroup" xmlns:wpi="http://schemas.microsoft.com/office/word/2010/wordprocessingInk" xmlns:wne="http://schemas.microsoft.com/office/word/2006/wordml" xmlns:wps="http://schemas.microsoft.com/office/word/2010/wordprocessingShape" mc:Ignorable="w14 w15 w16se w16cid w16 w16cex w16sdtdh w16sdtfl w16du wp14">
   <w:body>
     <w:p>
       <w:pPr>
-        <w:spacing w:before="0" w:after="60"/>
-      </w:pPr>
-      <w:r>
-        <w:rPr>
-          <w:rFonts w:ascii="Times New Roman" w:hAnsi="Times New Roman" w:eastAsia="Times New Roman" w:cs="Times New Roman"/>
+        <w:spacing w:after="60"/>
+      </w:pPr>
+      <w:r>
+        <w:rPr>
           <w:b/>
           <w:bCs/>
           <w:sz w:val="40"/>
           <w:szCs w:val="40"/>
         </w:rPr>
-        <w:t xml:space="preserve">QUY ĐỊNH NGHỈ PHÉP</w:t>
+        <w:t>QUY ĐỊNH NGHỈ PHÉP</w:t>
       </w:r>
     </w:p>
     <w:p>
@@ -22,16 +21,15 @@
         <w:pBdr>
           <w:bottom w:val="single" w:sz="8" w:space="8" w:color="000000"/>
         </w:pBdr>
-        <w:spacing w:before="0" w:after="200"/>
-      </w:pPr>
-      <w:r>
-        <w:rPr>
-          <w:rFonts w:ascii="Times New Roman" w:hAnsi="Times New Roman" w:eastAsia="Times New Roman" w:cs="Times New Roman"/>
+        <w:spacing w:after="200"/>
+      </w:pPr>
+      <w:r>
+        <w:rPr>
           <w:color w:val="666666"/>
           <w:sz w:val="20"/>
           <w:szCs w:val="20"/>
         </w:rPr>
-        <w:t xml:space="preserve">TOKOSI · Áp dụng cho toàn thể nhân viên · Ban hành: 05/10/2026</w:t>
+        <w:t>TOKOSI · Áp dụng cho toàn thể nhân viên · Ban hành: 05/10/2026</w:t>
       </w:r>
     </w:p>
     <w:p>
@@ -40,27 +38,21 @@
       </w:pPr>
       <w:r>
         <w:rPr>
-          <w:rFonts w:ascii="Times New Roman" w:hAnsi="Times New Roman" w:eastAsia="Times New Roman" w:cs="Times New Roman"/>
           <w:b/>
           <w:bCs/>
           <w:color w:val="1F4E9E"/>
           <w:sz w:val="28"/>
           <w:szCs w:val="28"/>
         </w:rPr>
-        <w:t xml:space="preserve">Quy định nghỉ phép</w:t>
+        <w:t>Quy định nghỉ phép</w:t>
       </w:r>
     </w:p>
     <w:p>
       <w:pPr>
-        <w:spacing w:before="0" w:after="100"/>
-      </w:pPr>
-      <w:r>
-        <w:rPr>
-          <w:rFonts w:ascii="Times New Roman" w:hAnsi="Times New Roman" w:eastAsia="Times New Roman" w:cs="Times New Roman"/>
-          <w:sz w:val="24"/>
-          <w:szCs w:val="24"/>
-        </w:rPr>
-        <w:t xml:space="preserve">Nhân viên cần xin phép và được quản lý đồng ý trước khi nghỉ. Thời hạn gửi yêu cầu phụ thuộc vào số ngày nghỉ.</w:t>
+        <w:spacing w:after="100"/>
+      </w:pPr>
+      <w:r>
+        <w:t>Nhân viên cần xin phép và được quản lý đồng ý trước khi nghỉ. Thời hạn gửi yêu cầu phụ thuộc vào số ngày nghỉ.</w:t>
       </w:r>
     </w:p>
     <w:p>
@@ -70,13 +62,12 @@
       </w:pPr>
       <w:r>
         <w:rPr>
-          <w:rFonts w:ascii="Times New Roman" w:hAnsi="Times New Roman" w:eastAsia="Times New Roman" w:cs="Times New Roman"/>
           <w:b/>
           <w:bCs/>
           <w:sz w:val="26"/>
           <w:szCs w:val="26"/>
         </w:rPr>
-        <w:t xml:space="preserve">Cách xin nghỉ phép</w:t>
+        <w:t>Cách xin nghỉ phép</w:t>
       </w:r>
     </w:p>
     <w:p>
@@ -86,34 +77,67 @@
           <w:ilvl w:val="0"/>
           <w:numId w:val="2"/>
         </w:numPr>
-        <w:spacing w:before="0" w:after="60"/>
-        <w:ind w:left="720" w:hanging="360"/>
-      </w:pPr>
-      <w:r>
-        <w:rPr>
-          <w:rFonts w:ascii="Times New Roman" w:hAnsi="Times New Roman" w:eastAsia="Times New Roman" w:cs="Times New Roman"/>
-          <w:sz w:val="24"/>
-          <w:szCs w:val="24"/>
-        </w:rPr>
-        <w:t xml:space="preserve">Nhắn tin xin nghỉ cho bot Telegram: </w:t>
-      </w:r>
-      <w:r>
-        <w:rPr>
-          <w:rFonts w:ascii="Times New Roman" w:hAnsi="Times New Roman" w:eastAsia="Times New Roman" w:cs="Times New Roman"/>
-          <w:b/>
-          <w:bCs/>
-          <w:sz w:val="24"/>
-          <w:szCs w:val="24"/>
-        </w:rPr>
-        <w:t xml:space="preserve">@nghiphieptks_bot</w:t>
-      </w:r>
-      <w:r>
-        <w:rPr>
-          <w:rFonts w:ascii="Times New Roman" w:hAnsi="Times New Roman" w:eastAsia="Times New Roman" w:cs="Times New Roman"/>
-          <w:sz w:val="24"/>
-          <w:szCs w:val="24"/>
-        </w:rPr>
-        <w:t xml:space="preserve">.</w:t>
+        <w:spacing w:after="60"/>
+      </w:pPr>
+      <w:r>
+        <w:t xml:space="preserve">Nhắn tin xin nghỉ </w:t>
+      </w:r>
+      <w:proofErr w:type="spellStart"/>
+      <w:r>
+        <w:t>cho</w:t>
+      </w:r>
+      <w:proofErr w:type="spellEnd"/>
+      <w:r>
+        <w:t xml:space="preserve"> bot Telegram: </w:t>
+      </w:r>
+      <w:r>
+        <w:rPr>
+          <w:b/>
+          <w:bCs/>
+        </w:rPr>
+        <w:t>@nghipheptks_bot</w:t>
+      </w:r>
+      <w:r>
+        <w:rPr>
+          <w:b/>
+          <w:bCs/>
+        </w:rPr>
+        <w:t xml:space="preserve"> </w:t>
+      </w:r>
+      <w:proofErr w:type="spellStart"/>
+      <w:r>
+        <w:t>hoặc</w:t>
+      </w:r>
+      <w:proofErr w:type="spellEnd"/>
+      <w:r>
+        <w:t xml:space="preserve"> </w:t>
+      </w:r>
+      <w:proofErr w:type="spellStart"/>
+      <w:r>
+        <w:t>tạo</w:t>
+      </w:r>
+      <w:proofErr w:type="spellEnd"/>
+      <w:r>
+        <w:t xml:space="preserve"> </w:t>
+      </w:r>
+      <w:proofErr w:type="spellStart"/>
+      <w:r>
+        <w:t>đơn</w:t>
+      </w:r>
+      <w:proofErr w:type="spellEnd"/>
+      <w:r>
+        <w:t xml:space="preserve"> </w:t>
+      </w:r>
+      <w:proofErr w:type="spellStart"/>
+      <w:r>
+        <w:t>trên</w:t>
+      </w:r>
+      <w:proofErr w:type="spellEnd"/>
+      <w:r>
+        <w:t xml:space="preserve"> web</w:t>
+      </w:r>
+      <w:r>
+        <w:t>.</w:t>
       </w:r>
     </w:p>
     <w:p>
@@ -123,16 +147,10 @@
           <w:ilvl w:val="0"/>
           <w:numId w:val="2"/>
         </w:numPr>
-        <w:spacing w:before="0" w:after="60"/>
-        <w:ind w:left="720" w:hanging="360"/>
-      </w:pPr>
-      <w:r>
-        <w:rPr>
-          <w:rFonts w:ascii="Times New Roman" w:hAnsi="Times New Roman" w:eastAsia="Times New Roman" w:cs="Times New Roman"/>
-          <w:sz w:val="24"/>
-          <w:szCs w:val="24"/>
-        </w:rPr>
-        <w:t xml:space="preserve">Chỉ được tính là đã xin phép khi yêu cầu được gửi qua bot đúng thời hạn quy định bên dưới.</w:t>
+        <w:spacing w:after="60"/>
+      </w:pPr>
+      <w:r>
+        <w:t>Chỉ được tính là đã xin phép khi yêu cầu được gửi qua bot đúng thời hạn quy định bên dưới.</w:t>
       </w:r>
     </w:p>
     <w:p>
@@ -142,16 +160,10 @@
           <w:ilvl w:val="0"/>
           <w:numId w:val="2"/>
         </w:numPr>
-        <w:spacing w:before="0" w:after="60"/>
-        <w:ind w:left="720" w:hanging="360"/>
-      </w:pPr>
-      <w:r>
-        <w:rPr>
-          <w:rFonts w:ascii="Times New Roman" w:hAnsi="Times New Roman" w:eastAsia="Times New Roman" w:cs="Times New Roman"/>
-          <w:sz w:val="24"/>
-          <w:szCs w:val="24"/>
-        </w:rPr>
-        <w:t xml:space="preserve">Đơn xin nghỉ phải ghi đủ: ngày nghỉ, lý do nghỉ và bàn giao công việc (người nhận bàn giao, nội dung bàn giao).</w:t>
+        <w:spacing w:after="60"/>
+      </w:pPr>
+      <w:r>
+        <w:t>Đơn xin nghỉ phải ghi đủ: ngày nghỉ, lý do nghỉ và bàn giao công việc (người nhận bàn giao, nội dung bàn giao).</w:t>
       </w:r>
     </w:p>
     <w:p>
@@ -161,13 +173,12 @@
       </w:pPr>
       <w:r>
         <w:rPr>
-          <w:rFonts w:ascii="Times New Roman" w:hAnsi="Times New Roman" w:eastAsia="Times New Roman" w:cs="Times New Roman"/>
           <w:b/>
           <w:bCs/>
           <w:sz w:val="26"/>
           <w:szCs w:val="26"/>
         </w:rPr>
-        <w:t xml:space="preserve">Thời hạn đăng ký nghỉ phép</w:t>
+        <w:t>Thời hạn đăng ký nghỉ phép</w:t>
       </w:r>
     </w:p>
     <w:p>
@@ -177,40 +188,196 @@
           <w:ilvl w:val="0"/>
           <w:numId w:val="2"/>
         </w:numPr>
-        <w:spacing w:before="0" w:after="60"/>
-        <w:ind w:left="720" w:hanging="360"/>
-      </w:pPr>
-      <w:r>
-        <w:rPr>
-          <w:rFonts w:ascii="Times New Roman" w:hAnsi="Times New Roman" w:eastAsia="Times New Roman" w:cs="Times New Roman"/>
-          <w:b/>
-          <w:bCs/>
-          <w:sz w:val="24"/>
-          <w:szCs w:val="24"/>
-        </w:rPr>
-        <w:t xml:space="preserve">Nghỉ dưới 1 ngày: </w:t>
-      </w:r>
-      <w:r>
-        <w:rPr>
-          <w:rFonts w:ascii="Times New Roman" w:hAnsi="Times New Roman" w:eastAsia="Times New Roman" w:cs="Times New Roman"/>
-          <w:sz w:val="24"/>
-          <w:szCs w:val="24"/>
-        </w:rPr>
-        <w:t xml:space="preserve">phải xin nghỉ trước 00:00 ngày trước đó.</w:t>
+        <w:spacing w:after="60"/>
+      </w:pPr>
+      <w:proofErr w:type="spellStart"/>
+      <w:r>
+        <w:rPr>
+          <w:b/>
+          <w:bCs/>
+        </w:rPr>
+        <w:t>Nghỉ</w:t>
+      </w:r>
+      <w:proofErr w:type="spellEnd"/>
+      <w:r>
+        <w:rPr>
+          <w:b/>
+          <w:bCs/>
+        </w:rPr>
+        <w:t xml:space="preserve"> </w:t>
+      </w:r>
+      <w:r>
+        <w:rPr>
+          <w:b/>
+          <w:bCs/>
+        </w:rPr>
+        <w:t>&lt;=</w:t>
+      </w:r>
+      <w:r>
+        <w:rPr>
+          <w:b/>
+          <w:bCs/>
+        </w:rPr>
+        <w:t xml:space="preserve"> 1 </w:t>
+      </w:r>
+      <w:proofErr w:type="spellStart"/>
+      <w:r>
+        <w:rPr>
+          <w:b/>
+          <w:bCs/>
+        </w:rPr>
+        <w:t>ngày</w:t>
+      </w:r>
+      <w:proofErr w:type="spellEnd"/>
+      <w:r>
+        <w:rPr>
+          <w:b/>
+          <w:bCs/>
+        </w:rPr>
+        <w:t xml:space="preserve">: </w:t>
+      </w:r>
+      <w:proofErr w:type="spellStart"/>
+      <w:r>
+        <w:t>phải</w:t>
+      </w:r>
+      <w:proofErr w:type="spellEnd"/>
+      <w:r>
+        <w:t xml:space="preserve"> </w:t>
+      </w:r>
+      <w:proofErr w:type="spellStart"/>
+      <w:r>
+        <w:t>xin</w:t>
+      </w:r>
+      <w:proofErr w:type="spellEnd"/>
+      <w:r>
+        <w:t xml:space="preserve"> </w:t>
+      </w:r>
+      <w:proofErr w:type="spellStart"/>
+      <w:r>
+        <w:t>nghỉ</w:t>
+      </w:r>
+      <w:proofErr w:type="spellEnd"/>
+      <w:r>
+        <w:t xml:space="preserve"> </w:t>
+      </w:r>
+      <w:proofErr w:type="spellStart"/>
+      <w:r>
+        <w:t>trước</w:t>
+      </w:r>
+      <w:proofErr w:type="spellEnd"/>
+      <w:r>
+        <w:t xml:space="preserve"> </w:t>
+      </w:r>
+      <w:r>
+        <w:t xml:space="preserve">23h59 </w:t>
+      </w:r>
+      <w:proofErr w:type="spellStart"/>
+      <w:r>
+        <w:t>của</w:t>
+      </w:r>
+      <w:proofErr w:type="spellEnd"/>
+      <w:r>
+        <w:t xml:space="preserve"> 02 </w:t>
+      </w:r>
+      <w:proofErr w:type="spellStart"/>
+      <w:r>
+        <w:t>ngày</w:t>
+      </w:r>
+      <w:proofErr w:type="spellEnd"/>
+      <w:r>
+        <w:t xml:space="preserve"> </w:t>
+      </w:r>
+      <w:proofErr w:type="spellStart"/>
+      <w:r>
+        <w:t>trước</w:t>
+      </w:r>
+      <w:proofErr w:type="spellEnd"/>
+      <w:r>
+        <w:t>.</w:t>
       </w:r>
     </w:p>
     <w:p>
       <w:pPr>
-        <w:spacing w:before="0" w:after="60"/>
+        <w:spacing w:after="60"/>
         <w:ind w:left="720"/>
       </w:pPr>
       <w:r>
-        <w:rPr>
-          <w:rFonts w:ascii="Times New Roman" w:hAnsi="Times New Roman" w:eastAsia="Times New Roman" w:cs="Times New Roman"/>
-          <w:sz w:val="24"/>
-          <w:szCs w:val="24"/>
-        </w:rPr>
-        <w:t xml:space="preserve">Ví dụ: Nghỉ từ thứ Ba → phải xin nghỉ trước 00:00 thứ Hai.</w:t>
+        <w:t xml:space="preserve">Ví dụ: Nghỉ </w:t>
+      </w:r>
+      <w:proofErr w:type="spellStart"/>
+      <w:r>
+        <w:t>từ</w:t>
+      </w:r>
+      <w:proofErr w:type="spellEnd"/>
+      <w:r>
+        <w:t xml:space="preserve"> </w:t>
+      </w:r>
+      <w:proofErr w:type="spellStart"/>
+      <w:r>
+        <w:t>thứ</w:t>
+      </w:r>
+      <w:proofErr w:type="spellEnd"/>
+      <w:r>
+        <w:t xml:space="preserve"> Ba → </w:t>
+      </w:r>
+      <w:proofErr w:type="spellStart"/>
+      <w:r>
+        <w:t>phải</w:t>
+      </w:r>
+      <w:proofErr w:type="spellEnd"/>
+      <w:r>
+        <w:t xml:space="preserve"> </w:t>
+      </w:r>
+      <w:proofErr w:type="spellStart"/>
+      <w:r>
+        <w:t>xin</w:t>
+      </w:r>
+      <w:proofErr w:type="spellEnd"/>
+      <w:r>
+        <w:t xml:space="preserve"> </w:t>
+      </w:r>
+      <w:proofErr w:type="spellStart"/>
+      <w:r>
+        <w:t>nghỉ</w:t>
+      </w:r>
+      <w:proofErr w:type="spellEnd"/>
+      <w:r>
+        <w:t xml:space="preserve"> </w:t>
+      </w:r>
+      <w:proofErr w:type="spellStart"/>
+      <w:r>
+        <w:t>trước</w:t>
+      </w:r>
+      <w:proofErr w:type="spellEnd"/>
+      <w:r>
+        <w:t xml:space="preserve"> </w:t>
+      </w:r>
+      <w:r>
+        <w:t xml:space="preserve">23h59 </w:t>
+      </w:r>
+      <w:proofErr w:type="spellStart"/>
+      <w:r>
+        <w:t>ngày</w:t>
+      </w:r>
+      <w:proofErr w:type="spellEnd"/>
+      <w:r>
+        <w:t xml:space="preserve"> </w:t>
+      </w:r>
+      <w:proofErr w:type="spellStart"/>
+      <w:r>
+        <w:t>Chủ</w:t>
+      </w:r>
+      <w:proofErr w:type="spellEnd"/>
+      <w:r>
+        <w:t xml:space="preserve"> </w:t>
+      </w:r>
+      <w:proofErr w:type="spellStart"/>
+      <w:r>
+        <w:t>nhật</w:t>
+      </w:r>
+      <w:proofErr w:type="spellEnd"/>
+      <w:r>
+        <w:t>.</w:t>
       </w:r>
     </w:p>
     <w:p>
@@ -220,54 +387,238 @@
           <w:ilvl w:val="0"/>
           <w:numId w:val="2"/>
         </w:numPr>
-        <w:spacing w:before="0" w:after="60"/>
-        <w:ind w:left="720" w:hanging="360"/>
-      </w:pPr>
-      <w:r>
-        <w:rPr>
-          <w:rFonts w:ascii="Times New Roman" w:hAnsi="Times New Roman" w:eastAsia="Times New Roman" w:cs="Times New Roman"/>
-          <w:b/>
-          <w:bCs/>
-          <w:sz w:val="24"/>
-          <w:szCs w:val="24"/>
-        </w:rPr>
-        <w:t xml:space="preserve">Nghỉ từ 02 ngày trở lên: </w:t>
-      </w:r>
-      <w:r>
-        <w:rPr>
-          <w:rFonts w:ascii="Times New Roman" w:hAnsi="Times New Roman" w:eastAsia="Times New Roman" w:cs="Times New Roman"/>
-          <w:sz w:val="24"/>
-          <w:szCs w:val="24"/>
-        </w:rPr>
-        <w:t xml:space="preserve">phải xin nghỉ trước 02 ngày (ngày Chủ nhật không tính).</w:t>
+        <w:spacing w:after="60"/>
+      </w:pPr>
+      <w:proofErr w:type="spellStart"/>
+      <w:r>
+        <w:rPr>
+          <w:b/>
+          <w:bCs/>
+        </w:rPr>
+        <w:t>Nghỉ</w:t>
+      </w:r>
+      <w:proofErr w:type="spellEnd"/>
+      <w:r>
+        <w:rPr>
+          <w:b/>
+          <w:bCs/>
+        </w:rPr>
+        <w:t xml:space="preserve"> </w:t>
+      </w:r>
+      <w:proofErr w:type="spellStart"/>
+      <w:r>
+        <w:rPr>
+          <w:b/>
+          <w:bCs/>
+        </w:rPr>
+        <w:t>trên</w:t>
+      </w:r>
+      <w:proofErr w:type="spellEnd"/>
+      <w:r>
+        <w:rPr>
+          <w:b/>
+          <w:bCs/>
+        </w:rPr>
+        <w:t xml:space="preserve"> 1 </w:t>
+      </w:r>
+      <w:proofErr w:type="spellStart"/>
+      <w:r>
+        <w:rPr>
+          <w:b/>
+          <w:bCs/>
+        </w:rPr>
+        <w:t>ngày</w:t>
+      </w:r>
+      <w:proofErr w:type="spellEnd"/>
+      <w:r>
+        <w:rPr>
+          <w:b/>
+          <w:bCs/>
+        </w:rPr>
+        <w:t xml:space="preserve">: </w:t>
+      </w:r>
+      <w:proofErr w:type="spellStart"/>
+      <w:r>
+        <w:t>phải</w:t>
+      </w:r>
+      <w:proofErr w:type="spellEnd"/>
+      <w:r>
+        <w:t xml:space="preserve"> </w:t>
+      </w:r>
+      <w:proofErr w:type="spellStart"/>
+      <w:r>
+        <w:t>xin</w:t>
+      </w:r>
+      <w:proofErr w:type="spellEnd"/>
+      <w:r>
+        <w:t xml:space="preserve"> </w:t>
+      </w:r>
+      <w:proofErr w:type="spellStart"/>
+      <w:r>
+        <w:t>nghỉ</w:t>
+      </w:r>
+      <w:proofErr w:type="spellEnd"/>
+      <w:r>
+        <w:t xml:space="preserve"> </w:t>
+      </w:r>
+      <w:proofErr w:type="spellStart"/>
+      <w:r>
+        <w:t>trước</w:t>
+      </w:r>
+      <w:proofErr w:type="spellEnd"/>
+      <w:r>
+        <w:t xml:space="preserve"> 23h59 </w:t>
+      </w:r>
+      <w:proofErr w:type="spellStart"/>
+      <w:r>
+        <w:t>của</w:t>
+      </w:r>
+      <w:proofErr w:type="spellEnd"/>
+      <w:r>
+        <w:t xml:space="preserve"> 0</w:t>
+      </w:r>
+      <w:r>
+        <w:t>3</w:t>
+      </w:r>
+      <w:r>
+        <w:t xml:space="preserve"> </w:t>
+      </w:r>
+      <w:proofErr w:type="spellStart"/>
+      <w:r>
+        <w:t>ngày</w:t>
+      </w:r>
+      <w:proofErr w:type="spellEnd"/>
+      <w:r>
+        <w:t xml:space="preserve"> </w:t>
+      </w:r>
+      <w:proofErr w:type="spellStart"/>
+      <w:r>
+        <w:t>trước</w:t>
+      </w:r>
+      <w:proofErr w:type="spellEnd"/>
+      <w:r>
+        <w:t>.</w:t>
       </w:r>
     </w:p>
     <w:p>
       <w:pPr>
-        <w:spacing w:before="0" w:after="60"/>
-        <w:ind w:left="720"/>
-      </w:pPr>
-      <w:r>
-        <w:rPr>
-          <w:rFonts w:ascii="Times New Roman" w:hAnsi="Times New Roman" w:eastAsia="Times New Roman" w:cs="Times New Roman"/>
-          <w:sz w:val="24"/>
-          <w:szCs w:val="24"/>
-        </w:rPr>
-        <w:t xml:space="preserve">Ví dụ: Nghỉ ngày thứ Tư và thứ Năm → phải xin nghỉ trước 00:00 thứ Hai.</w:t>
-      </w:r>
-    </w:p>
-    <w:p>
-      <w:pPr>
-        <w:spacing w:before="0" w:after="60"/>
-        <w:ind w:left="720"/>
-      </w:pPr>
-      <w:r>
-        <w:rPr>
-          <w:rFonts w:ascii="Times New Roman" w:hAnsi="Times New Roman" w:eastAsia="Times New Roman" w:cs="Times New Roman"/>
-          <w:sz w:val="24"/>
-          <w:szCs w:val="24"/>
-        </w:rPr>
-        <w:t xml:space="preserve">Ví dụ: Nghỉ ngày thứ Hai và thứ Ba → phải xin nghỉ trước 00:00 thứ Sáu.</w:t>
+        <w:spacing w:after="60"/>
+        <w:ind w:left="360" w:firstLine="360"/>
+      </w:pPr>
+      <w:proofErr w:type="spellStart"/>
+      <w:r>
+        <w:t>Ví</w:t>
+      </w:r>
+      <w:proofErr w:type="spellEnd"/>
+      <w:r>
+        <w:t xml:space="preserve"> </w:t>
+      </w:r>
+      <w:proofErr w:type="spellStart"/>
+      <w:r>
+        <w:t>dụ</w:t>
+      </w:r>
+      <w:proofErr w:type="spellEnd"/>
+      <w:r>
+        <w:t xml:space="preserve">: </w:t>
+      </w:r>
+      <w:proofErr w:type="spellStart"/>
+      <w:r>
+        <w:t>Nghỉ</w:t>
+      </w:r>
+      <w:proofErr w:type="spellEnd"/>
+      <w:r>
+        <w:t xml:space="preserve"> </w:t>
+      </w:r>
+      <w:proofErr w:type="spellStart"/>
+      <w:r>
+        <w:t>ngày</w:t>
+      </w:r>
+      <w:proofErr w:type="spellEnd"/>
+      <w:r>
+        <w:t xml:space="preserve"> </w:t>
+      </w:r>
+      <w:proofErr w:type="spellStart"/>
+      <w:r>
+        <w:t>thứ</w:t>
+      </w:r>
+      <w:proofErr w:type="spellEnd"/>
+      <w:r>
+        <w:t xml:space="preserve"> </w:t>
+      </w:r>
+      <w:proofErr w:type="spellStart"/>
+      <w:r>
+        <w:t>Năm</w:t>
+      </w:r>
+      <w:proofErr w:type="spellEnd"/>
+      <w:r>
+        <w:t xml:space="preserve"> </w:t>
+      </w:r>
+      <w:proofErr w:type="spellStart"/>
+      <w:r>
+        <w:t>và</w:t>
+      </w:r>
+      <w:proofErr w:type="spellEnd"/>
+      <w:r>
+        <w:t xml:space="preserve"> </w:t>
+      </w:r>
+      <w:proofErr w:type="spellStart"/>
+      <w:r>
+        <w:t>thứ</w:t>
+      </w:r>
+      <w:proofErr w:type="spellEnd"/>
+      <w:r>
+        <w:t xml:space="preserve"> </w:t>
+      </w:r>
+      <w:proofErr w:type="spellStart"/>
+      <w:r>
+        <w:t>Sáu</w:t>
+      </w:r>
+      <w:proofErr w:type="spellEnd"/>
+      <w:r>
+        <w:t xml:space="preserve">→ </w:t>
+      </w:r>
+      <w:proofErr w:type="spellStart"/>
+      <w:r>
+        <w:t>phải</w:t>
+      </w:r>
+      <w:proofErr w:type="spellEnd"/>
+      <w:r>
+        <w:t xml:space="preserve"> </w:t>
+      </w:r>
+      <w:proofErr w:type="spellStart"/>
+      <w:r>
+        <w:t>xin</w:t>
+      </w:r>
+      <w:proofErr w:type="spellEnd"/>
+      <w:r>
+        <w:t xml:space="preserve"> </w:t>
+      </w:r>
+      <w:proofErr w:type="spellStart"/>
+      <w:r>
+        <w:t>nghỉ</w:t>
+      </w:r>
+      <w:proofErr w:type="spellEnd"/>
+      <w:r>
+        <w:t xml:space="preserve"> </w:t>
+      </w:r>
+      <w:proofErr w:type="spellStart"/>
+      <w:r>
+        <w:t>trước</w:t>
+      </w:r>
+      <w:proofErr w:type="spellEnd"/>
+      <w:r>
+        <w:t xml:space="preserve"> </w:t>
+      </w:r>
+      <w:r>
+        <w:t xml:space="preserve">23h59 </w:t>
+      </w:r>
+      <w:proofErr w:type="spellStart"/>
+      <w:r>
+        <w:t>thứ</w:t>
+      </w:r>
+      <w:proofErr w:type="spellEnd"/>
+      <w:r>
+        <w:t xml:space="preserve"> Hai</w:t>
       </w:r>
     </w:p>
     <w:p>
@@ -277,26 +628,17 @@
           <w:ilvl w:val="0"/>
           <w:numId w:val="2"/>
         </w:numPr>
-        <w:spacing w:before="0" w:after="60"/>
-        <w:ind w:left="720" w:hanging="360"/>
-      </w:pPr>
-      <w:r>
-        <w:rPr>
-          <w:rFonts w:ascii="Times New Roman" w:hAnsi="Times New Roman" w:eastAsia="Times New Roman" w:cs="Times New Roman"/>
-          <w:b/>
-          <w:bCs/>
-          <w:sz w:val="24"/>
-          <w:szCs w:val="24"/>
+        <w:spacing w:after="60"/>
+      </w:pPr>
+      <w:r>
+        <w:rPr>
+          <w:b/>
+          <w:bCs/>
         </w:rPr>
         <w:t xml:space="preserve">Nghỉ gấp </w:t>
       </w:r>
       <w:r>
-        <w:rPr>
-          <w:rFonts w:ascii="Times New Roman" w:hAnsi="Times New Roman" w:eastAsia="Times New Roman" w:cs="Times New Roman"/>
-          <w:sz w:val="24"/>
-          <w:szCs w:val="24"/>
-        </w:rPr>
-        <w:t xml:space="preserve">(ốm đau, ma chay, đột xuất khác…): có lý do hợp lý, quản lý sẽ duyệt bù. Những trường hợp gấp nhắn tin riêng cho quản lý để trình bày lý do.</w:t>
+        <w:t>(ốm đau, ma chay, đột xuất khác…): có lý do hợp lý, quản lý sẽ duyệt bù. Những trường hợp gấp nhắn tin riêng cho quản lý để trình bày lý do.</w:t>
       </w:r>
     </w:p>
     <w:p>
@@ -306,13 +648,12 @@
       </w:pPr>
       <w:r>
         <w:rPr>
-          <w:rFonts w:ascii="Times New Roman" w:hAnsi="Times New Roman" w:eastAsia="Times New Roman" w:cs="Times New Roman"/>
           <w:b/>
           <w:bCs/>
           <w:sz w:val="26"/>
           <w:szCs w:val="26"/>
         </w:rPr>
-        <w:t xml:space="preserve">Bàn giao công việc</w:t>
+        <w:t>Bàn giao công việc</w:t>
       </w:r>
     </w:p>
     <w:p>
@@ -322,16 +663,39 @@
           <w:ilvl w:val="0"/>
           <w:numId w:val="2"/>
         </w:numPr>
-        <w:spacing w:before="0" w:after="60"/>
-        <w:ind w:left="720" w:hanging="360"/>
-      </w:pPr>
-      <w:r>
-        <w:rPr>
-          <w:rFonts w:ascii="Times New Roman" w:hAnsi="Times New Roman" w:eastAsia="Times New Roman" w:cs="Times New Roman"/>
-          <w:sz w:val="24"/>
-          <w:szCs w:val="24"/>
-        </w:rPr>
-        <w:t xml:space="preserve">Mọi đơn xin nghỉ đều phải kèm bàn giao công việc: ghi rõ người nhận bàn giao và nội dung bàn giao (việc đang làm, việc cần xử lý trong thời gian nghỉ, lưu ý cần biết).</w:t>
+        <w:spacing w:after="60"/>
+      </w:pPr>
+      <w:proofErr w:type="spellStart"/>
+      <w:r>
+        <w:t>Đơn</w:t>
+      </w:r>
+      <w:proofErr w:type="spellEnd"/>
+      <w:r>
+        <w:t xml:space="preserve"> </w:t>
+      </w:r>
+      <w:proofErr w:type="spellStart"/>
+      <w:r>
+        <w:t>không</w:t>
+      </w:r>
+      <w:proofErr w:type="spellEnd"/>
+      <w:r>
+        <w:t xml:space="preserve"> </w:t>
+      </w:r>
+      <w:proofErr w:type="spellStart"/>
+      <w:r>
+        <w:t>có</w:t>
+      </w:r>
+      <w:proofErr w:type="spellEnd"/>
+      <w:r>
+        <w:t xml:space="preserve"> </w:t>
+      </w:r>
+      <w:proofErr w:type="spellStart"/>
+      <w:r>
+        <w:t>thông</w:t>
+      </w:r>
+      <w:proofErr w:type="spellEnd"/>
+      <w:r>
+        <w:t xml:space="preserve"> tin bàn giao chưa được tính là đã xin phép, quản lý có thể từ chối.</w:t>
       </w:r>
     </w:p>
     <w:p>
@@ -341,16 +705,10 @@
           <w:ilvl w:val="0"/>
           <w:numId w:val="2"/>
         </w:numPr>
-        <w:spacing w:before="0" w:after="60"/>
-        <w:ind w:left="720" w:hanging="360"/>
-      </w:pPr>
-      <w:r>
-        <w:rPr>
-          <w:rFonts w:ascii="Times New Roman" w:hAnsi="Times New Roman" w:eastAsia="Times New Roman" w:cs="Times New Roman"/>
-          <w:sz w:val="24"/>
-          <w:szCs w:val="24"/>
-        </w:rPr>
-        <w:t xml:space="preserve">Đơn không có thông tin bàn giao chưa được tính là đã xin phép, quản lý có thể từ chối.</w:t>
+        <w:spacing w:after="60"/>
+      </w:pPr>
+      <w:r>
+        <w:t>Nghỉ gấp: bàn giao cho quản lý và người thay thế qua tin nhắn riêng ngay khi có thể.</w:t>
       </w:r>
     </w:p>
     <w:p>
@@ -360,16 +718,137 @@
           <w:ilvl w:val="0"/>
           <w:numId w:val="2"/>
         </w:numPr>
-        <w:spacing w:before="0" w:after="60"/>
-        <w:ind w:left="720" w:hanging="360"/>
-      </w:pPr>
-      <w:r>
-        <w:rPr>
-          <w:rFonts w:ascii="Times New Roman" w:hAnsi="Times New Roman" w:eastAsia="Times New Roman" w:cs="Times New Roman"/>
-          <w:sz w:val="24"/>
-          <w:szCs w:val="24"/>
-        </w:rPr>
-        <w:t xml:space="preserve">Nghỉ gấp: bàn giao cho quản lý và người thay thế qua tin nhắn riêng ngay khi có thể.</w:t>
+        <w:spacing w:after="60"/>
+      </w:pPr>
+      <w:proofErr w:type="spellStart"/>
+      <w:r>
+        <w:t>Người</w:t>
+      </w:r>
+      <w:proofErr w:type="spellEnd"/>
+      <w:r>
+        <w:t xml:space="preserve"> </w:t>
+      </w:r>
+      <w:proofErr w:type="spellStart"/>
+      <w:r>
+        <w:t>nhận</w:t>
+      </w:r>
+      <w:proofErr w:type="spellEnd"/>
+      <w:r>
+        <w:t xml:space="preserve"> </w:t>
+      </w:r>
+      <w:proofErr w:type="spellStart"/>
+      <w:r>
+        <w:t>bàn</w:t>
+      </w:r>
+      <w:proofErr w:type="spellEnd"/>
+      <w:r>
+        <w:t xml:space="preserve"> </w:t>
+      </w:r>
+      <w:proofErr w:type="spellStart"/>
+      <w:r>
+        <w:t>giao</w:t>
+      </w:r>
+      <w:proofErr w:type="spellEnd"/>
+      <w:r>
+        <w:t xml:space="preserve"> chịu trách nhiệm xử lý các việc được giao trong thời </w:t>
+      </w:r>
+      <w:proofErr w:type="spellStart"/>
+      <w:r>
+        <w:t>gian</w:t>
+      </w:r>
+      <w:proofErr w:type="spellEnd"/>
+      <w:r>
+        <w:t xml:space="preserve"> </w:t>
+      </w:r>
+      <w:proofErr w:type="spellStart"/>
+      <w:r>
+        <w:t>đồng</w:t>
+      </w:r>
+      <w:proofErr w:type="spellEnd"/>
+      <w:r>
+        <w:t xml:space="preserve"> </w:t>
+      </w:r>
+      <w:proofErr w:type="spellStart"/>
+      <w:r>
+        <w:t>nghiệp</w:t>
+      </w:r>
+      <w:proofErr w:type="spellEnd"/>
+      <w:r>
+        <w:t xml:space="preserve"> </w:t>
+      </w:r>
+      <w:proofErr w:type="spellStart"/>
+      <w:r>
+        <w:t>nghỉ</w:t>
+      </w:r>
+      <w:proofErr w:type="spellEnd"/>
+      <w:r>
+        <w:t>.</w:t>
+      </w:r>
+    </w:p>
+    <w:p>
+      <w:pPr>
+        <w:keepNext/>
+        <w:spacing w:before="240" w:after="80"/>
+      </w:pPr>
+      <w:proofErr w:type="spellStart"/>
+      <w:r>
+        <w:rPr>
+          <w:b/>
+          <w:bCs/>
+          <w:sz w:val="26"/>
+          <w:szCs w:val="26"/>
+        </w:rPr>
+        <w:t>Xử</w:t>
+      </w:r>
+      <w:proofErr w:type="spellEnd"/>
+      <w:r>
+        <w:rPr>
+          <w:b/>
+          <w:bCs/>
+          <w:sz w:val="26"/>
+          <w:szCs w:val="26"/>
+        </w:rPr>
+        <w:t xml:space="preserve"> </w:t>
+      </w:r>
+      <w:proofErr w:type="spellStart"/>
+      <w:r>
+        <w:rPr>
+          <w:b/>
+          <w:bCs/>
+          <w:sz w:val="26"/>
+          <w:szCs w:val="26"/>
+        </w:rPr>
+        <w:t>lý</w:t>
+      </w:r>
+      <w:proofErr w:type="spellEnd"/>
+      <w:r>
+        <w:rPr>
+          <w:b/>
+          <w:bCs/>
+          <w:sz w:val="26"/>
+          <w:szCs w:val="26"/>
+        </w:rPr>
+        <w:t xml:space="preserve"> vi </w:t>
+      </w:r>
+      <w:proofErr w:type="spellStart"/>
+      <w:r>
+        <w:rPr>
+          <w:b/>
+          <w:bCs/>
+          <w:sz w:val="26"/>
+          <w:szCs w:val="26"/>
+        </w:rPr>
+        <w:t>phạm</w:t>
+      </w:r>
+      <w:proofErr w:type="spellEnd"/>
+      <w:r>
+        <w:rPr>
+          <w:b/>
+          <w:bCs/>
+          <w:sz w:val="26"/>
+          <w:szCs w:val="26"/>
+        </w:rPr>
+        <w:t xml:space="preserve">: </w:t>
       </w:r>
     </w:p>
     <w:p>
@@ -379,32 +858,17 @@
           <w:ilvl w:val="0"/>
           <w:numId w:val="2"/>
         </w:numPr>
-        <w:spacing w:before="0" w:after="60"/>
-        <w:ind w:left="720" w:hanging="360"/>
-      </w:pPr>
-      <w:r>
-        <w:rPr>
-          <w:rFonts w:ascii="Times New Roman" w:hAnsi="Times New Roman" w:eastAsia="Times New Roman" w:cs="Times New Roman"/>
-          <w:sz w:val="24"/>
-          <w:szCs w:val="24"/>
-        </w:rPr>
-        <w:t xml:space="preserve">Người nhận bàn giao chịu trách nhiệm xử lý các việc được giao trong thời gian đồng nghiệp nghỉ.</w:t>
-      </w:r>
-    </w:p>
-    <w:p>
-      <w:pPr>
-        <w:keepNext/>
-        <w:spacing w:before="240" w:after="80"/>
-      </w:pPr>
-      <w:r>
-        <w:rPr>
-          <w:rFonts w:ascii="Times New Roman" w:hAnsi="Times New Roman" w:eastAsia="Times New Roman" w:cs="Times New Roman"/>
-          <w:b/>
-          <w:bCs/>
-          <w:sz w:val="26"/>
-          <w:szCs w:val="26"/>
-        </w:rPr>
-        <w:t xml:space="preserve">Xử lý vi phạm</w:t>
+        <w:spacing w:after="60"/>
+      </w:pPr>
+      <w:r>
+        <w:t xml:space="preserve">Gửi yêu cầu xin nghỉ trễ hạn: </w:t>
+      </w:r>
+      <w:r>
+        <w:rPr>
+          <w:b/>
+          <w:bCs/>
+        </w:rPr>
+        <w:t>phạt 50.000đ/lần.</w:t>
       </w:r>
     </w:p>
     <w:p>
@@ -414,26 +878,17 @@
           <w:ilvl w:val="0"/>
           <w:numId w:val="2"/>
         </w:numPr>
-        <w:spacing w:before="0" w:after="60"/>
-        <w:ind w:left="720" w:hanging="360"/>
-      </w:pPr>
-      <w:r>
-        <w:rPr>
-          <w:rFonts w:ascii="Times New Roman" w:hAnsi="Times New Roman" w:eastAsia="Times New Roman" w:cs="Times New Roman"/>
-          <w:sz w:val="24"/>
-          <w:szCs w:val="24"/>
-        </w:rPr>
-        <w:t xml:space="preserve">Gửi yêu cầu xin nghỉ trễ hạn: </w:t>
-      </w:r>
-      <w:r>
-        <w:rPr>
-          <w:rFonts w:ascii="Times New Roman" w:hAnsi="Times New Roman" w:eastAsia="Times New Roman" w:cs="Times New Roman"/>
-          <w:b/>
-          <w:bCs/>
-          <w:sz w:val="24"/>
-          <w:szCs w:val="24"/>
-        </w:rPr>
-        <w:t xml:space="preserve">phạt 50.000đ/lần.</w:t>
+        <w:spacing w:after="60"/>
+      </w:pPr>
+      <w:r>
+        <w:t xml:space="preserve">Tự ý nghỉ không xin phép, hoặc quản lý đã từ chối nhưng vẫn nghỉ: </w:t>
+      </w:r>
+      <w:r>
+        <w:rPr>
+          <w:b/>
+          <w:bCs/>
+        </w:rPr>
+        <w:t>phạt 500.000đ/lần.</w:t>
       </w:r>
     </w:p>
     <w:p>
@@ -443,68 +898,25 @@
           <w:ilvl w:val="0"/>
           <w:numId w:val="2"/>
         </w:numPr>
-        <w:spacing w:before="0" w:after="60"/>
-        <w:ind w:left="720" w:hanging="360"/>
-      </w:pPr>
-      <w:r>
-        <w:rPr>
-          <w:rFonts w:ascii="Times New Roman" w:hAnsi="Times New Roman" w:eastAsia="Times New Roman" w:cs="Times New Roman"/>
-          <w:sz w:val="24"/>
-          <w:szCs w:val="24"/>
-        </w:rPr>
-        <w:t xml:space="preserve">Tự ý nghỉ không xin phép, hoặc quản lý đã từ chối nhưng vẫn nghỉ: </w:t>
-      </w:r>
-      <w:r>
-        <w:rPr>
-          <w:rFonts w:ascii="Times New Roman" w:hAnsi="Times New Roman" w:eastAsia="Times New Roman" w:cs="Times New Roman"/>
-          <w:b/>
-          <w:bCs/>
-          <w:sz w:val="24"/>
-          <w:szCs w:val="24"/>
-        </w:rPr>
-        <w:t xml:space="preserve">phạt 500.000đ/lần.</w:t>
+        <w:spacing w:after="60"/>
+      </w:pPr>
+      <w:r>
+        <w:t>Tất cả các khoản phạt này sẽ trừ vào lương cuối tháng đó.</w:t>
       </w:r>
     </w:p>
     <w:p>
       <w:pPr>
-        <w:pStyle w:val="ListParagraph"/>
-        <w:numPr>
-          <w:ilvl w:val="0"/>
-          <w:numId w:val="2"/>
-        </w:numPr>
-        <w:spacing w:before="0" w:after="60"/>
-        <w:ind w:left="720" w:hanging="360"/>
-      </w:pPr>
-      <w:r>
-        <w:rPr>
-          <w:rFonts w:ascii="Times New Roman" w:hAnsi="Times New Roman" w:eastAsia="Times New Roman" w:cs="Times New Roman"/>
-          <w:sz w:val="24"/>
-          <w:szCs w:val="24"/>
-        </w:rPr>
-        <w:t xml:space="preserve">Tất cả các khoản phạt này sẽ trừ vào lương cuối tháng đó.</w:t>
-      </w:r>
-    </w:p>
-    <w:p>
-      <w:pPr>
         <w:spacing w:before="200" w:after="100"/>
       </w:pPr>
       <w:r>
         <w:rPr>
-          <w:rFonts w:ascii="Times New Roman" w:hAnsi="Times New Roman" w:eastAsia="Times New Roman" w:cs="Times New Roman"/>
-          <w:b/>
-          <w:bCs/>
-          <w:sz w:val="24"/>
-          <w:szCs w:val="24"/>
+          <w:b/>
+          <w:bCs/>
         </w:rPr>
         <w:t xml:space="preserve">Lưu ý: </w:t>
       </w:r>
       <w:r>
-        <w:rPr>
-          <w:rFonts w:ascii="Times New Roman" w:hAnsi="Times New Roman" w:eastAsia="Times New Roman" w:cs="Times New Roman"/>
-          <w:sz w:val="24"/>
-          <w:szCs w:val="24"/>
-        </w:rPr>
-        <w:t xml:space="preserve">Ban quản lý sẽ giám sát và xử lý nghiêm minh, không có ngoại lệ.</w:t>
+        <w:t>Ban quản lý sẽ giám sát và xử lý nghiêm minh, không có ngoại lệ.</w:t>
       </w:r>
     </w:p>
     <w:p>
@@ -512,17 +924,16 @@
         <w:pBdr>
           <w:top w:val="single" w:sz="4" w:space="8" w:color="BBBBBB"/>
         </w:pBdr>
-        <w:spacing w:before="360" w:after="0"/>
+        <w:spacing w:before="360"/>
         <w:jc w:val="center"/>
       </w:pPr>
       <w:r>
         <w:rPr>
-          <w:rFonts w:ascii="Times New Roman" w:hAnsi="Times New Roman" w:eastAsia="Times New Roman" w:cs="Times New Roman"/>
           <w:color w:val="888888"/>
           <w:sz w:val="18"/>
           <w:szCs w:val="18"/>
         </w:rPr>
-        <w:t xml:space="preserve">TOKOSI Dashboard · Tài liệu nội bộ · Vui lòng không sao chép hoặc chia sẻ ra bên ngoài công ty</w:t>
+        <w:t>TOKOSI Dashboard · Tài liệu nội bộ · Vui lòng không sao chép hoặc chia sẻ ra bên ngoài công ty</w:t>
       </w:r>
     </w:p>
     <w:sectPr>
@@ -536,7 +947,7 @@
 </file>
 
 <file path=word/numbering.xml><?xml version="1.0" encoding="utf-8"?>
-<w:numbering xmlns:wpc="http://schemas.microsoft.com/office/word/2010/wordprocessingCanvas" xmlns:cx="http://schemas.microsoft.com/office/drawing/2014/chartex" xmlns:cx1="http://schemas.microsoft.com/office/drawing/2015/9/8/chartex" xmlns:cx2="http://schemas.microsoft.com/office/drawing/2015/10/21/chartex" xmlns:cx3="http://schemas.microsoft.com/office/drawing/2016/5/9/chartex" xmlns:cx4="http://schemas.microsoft.com/office/drawing/2016/5/10/chartex" xmlns:cx5="http://schemas.microsoft.com/office/drawing/2016/5/11/chartex" xmlns:cx6="http://schemas.microsoft.com/office/drawing/2016/5/12/chartex" xmlns:cx7="http://schemas.microsoft.com/office/drawing/2016/5/13/chartex" xmlns:cx8="http://schemas.microsoft.com/office/drawing/2016/5/14/chartex" xmlns:mc="http://schemas.openxmlformats.org/markup-compatibility/2006" xmlns:aink="http://schemas.microsoft.com/office/drawing/2016/ink" xmlns:am3d="http://schemas.microsoft.com/office/drawing/2017/model3d" xmlns:o="urn:schemas-microsoft-com:office:office" xmlns:r="http://schemas.openxmlformats.org/officeDocument/2006/relationships" xmlns:m="http://schemas.openxmlformats.org/officeDocument/2006/math" xmlns:v="urn:schemas-microsoft-com:vml" xmlns:wp14="http://schemas.microsoft.com/office/word/2010/wordprocessingDrawing" xmlns:wp="http://schemas.openxmlformats.org/drawingml/2006/wordprocessingDrawing" xmlns:w10="urn:schemas-microsoft-com:office:word" xmlns:w="http://schemas.openxmlformats.org/wordprocessingml/2006/main" xmlns:w14="http://schemas.microsoft.com/office/word/2010/wordml" xmlns:w15="http://schemas.microsoft.com/office/word/2012/wordml" xmlns:w16cex="http://schemas.microsoft.com/office/word/2018/wordml/cex" xmlns:w16cid="http://schemas.microsoft.com/office/word/2016/wordml/cid" xmlns:w16="http://schemas.microsoft.com/office/word/2018/wordml" xmlns:w16sdtdh="http://schemas.microsoft.com/office/word/2020/wordml/sdtdatahash" xmlns:w16se="http://schemas.microsoft.com/office/word/2015/wordml/symex" xmlns:wpg="http://schemas.microsoft.com/office/word/2010/wordprocessingGroup" xmlns:wpi="http://schemas.microsoft.com/office/word/2010/wordprocessingInk" xmlns:wne="http://schemas.microsoft.com/office/word/2006/wordml" xmlns:wps="http://schemas.microsoft.com/office/word/2010/wordprocessingShape" mc:Ignorable="w14 w15 w16se w16cid w16 w16cex w16sdtdh wp14">
+<w:numbering xmlns:wpc="http://schemas.microsoft.com/office/word/2010/wordprocessingCanvas" xmlns:cx="http://schemas.microsoft.com/office/drawing/2014/chartex" xmlns:cx1="http://schemas.microsoft.com/office/drawing/2015/9/8/chartex" xmlns:cx2="http://schemas.microsoft.com/office/drawing/2015/10/21/chartex" xmlns:cx3="http://schemas.microsoft.com/office/drawing/2016/5/9/chartex" xmlns:cx4="http://schemas.microsoft.com/office/drawing/2016/5/10/chartex" xmlns:cx5="http://schemas.microsoft.com/office/drawing/2016/5/11/chartex" xmlns:cx6="http://schemas.microsoft.com/office/drawing/2016/5/12/chartex" xmlns:cx7="http://schemas.microsoft.com/office/drawing/2016/5/13/chartex" xmlns:cx8="http://schemas.microsoft.com/office/drawing/2016/5/14/chartex" xmlns:mc="http://schemas.openxmlformats.org/markup-compatibility/2006" xmlns:aink="http://schemas.microsoft.com/office/drawing/2016/ink" xmlns:am3d="http://schemas.microsoft.com/office/drawing/2017/model3d" xmlns:o="urn:schemas-microsoft-com:office:office" xmlns:oel="http://schemas.microsoft.com/office/2019/extlst" xmlns:r="http://schemas.openxmlformats.org/officeDocument/2006/relationships" xmlns:m="http://schemas.openxmlformats.org/officeDocument/2006/math" xmlns:v="urn:schemas-microsoft-com:vml" xmlns:wp14="http://schemas.microsoft.com/office/word/2010/wordprocessingDrawing" xmlns:wp="http://schemas.openxmlformats.org/drawingml/2006/wordprocessingDrawing" xmlns:w10="urn:schemas-microsoft-com:office:word" xmlns:w="http://schemas.openxmlformats.org/wordprocessingml/2006/main" xmlns:w14="http://schemas.microsoft.com/office/word/2010/wordml" xmlns:w15="http://schemas.microsoft.com/office/word/2012/wordml" xmlns:w16cex="http://schemas.microsoft.com/office/word/2018/wordml/cex" xmlns:w16cid="http://schemas.microsoft.com/office/word/2016/wordml/cid" xmlns:w16="http://schemas.microsoft.com/office/word/2018/wordml" xmlns:w16du="http://schemas.microsoft.com/office/word/2023/wordml/word16du" xmlns:w16sdtdh="http://schemas.microsoft.com/office/word/2020/wordml/sdtdatahash" xmlns:w16sdtfl="http://schemas.microsoft.com/office/word/2024/wordml/sdtformatlock" xmlns:w16se="http://schemas.microsoft.com/office/word/2015/wordml/symex" xmlns:wpg="http://schemas.microsoft.com/office/word/2010/wordprocessingGroup" xmlns:wpi="http://schemas.microsoft.com/office/word/2010/wordprocessingInk" xmlns:wne="http://schemas.microsoft.com/office/word/2006/wordml" xmlns:wps="http://schemas.microsoft.com/office/word/2010/wordprocessingShape" mc:Ignorable="w14 w15 w16se w16cid w16 w16cex w16sdtdh w16sdtfl w16du wp14">
   <w:abstractNum w:abstractNumId="0" w15:restartNumberingAfterBreak="0">
     <w:nsid w:val="2A006C48"/>
     <w:multiLevelType w:val="hybridMultilevel"/>
@@ -1130,35 +1541,38 @@
       </w:pPr>
     </w:lvl>
   </w:abstractNum>
-  <w:num w:numId="1">
+  <w:num w:numId="1" w16cid:durableId="1808160200">
     <w:abstractNumId w:val="5"/>
     <w:lvlOverride w:ilvl="0">
       <w:startOverride w:val="1"/>
     </w:lvlOverride>
   </w:num>
-  <w:num w:numId="2">
+  <w:num w:numId="2" w16cid:durableId="502664993">
     <w:abstractNumId w:val="3"/>
     <w:lvlOverride w:ilvl="0">
       <w:startOverride w:val="1"/>
     </w:lvlOverride>
   </w:num>
-  <w:num w:numId="3">
+  <w:num w:numId="3" w16cid:durableId="30041027">
     <w:abstractNumId w:val="1"/>
   </w:num>
-  <w:num w:numId="4">
+  <w:num w:numId="4" w16cid:durableId="1235891093">
     <w:abstractNumId w:val="0"/>
   </w:num>
-  <w:num w:numId="5">
+  <w:num w:numId="5" w16cid:durableId="657879285">
     <w:abstractNumId w:val="2"/>
   </w:num>
-  <w:num w:numId="6">
+  <w:num w:numId="6" w16cid:durableId="167335517">
     <w:abstractNumId w:val="4"/>
+  </w:num>
+  <w:num w:numId="7" w16cid:durableId="1330913426">
+    <w:abstractNumId w:val="3"/>
   </w:num>
 </w:numbering>
 </file>
 
 <file path=word/styles.xml><?xml version="1.0" encoding="utf-8"?>
-<w:styles xmlns:mc="http://schemas.openxmlformats.org/markup-compatibility/2006" xmlns:r="http://schemas.openxmlformats.org/officeDocument/2006/relationships" xmlns:w="http://schemas.openxmlformats.org/wordprocessingml/2006/main" xmlns:w14="http://schemas.microsoft.com/office/word/2010/wordml" xmlns:w15="http://schemas.microsoft.com/office/word/2012/wordml" xmlns:w16cex="http://schemas.microsoft.com/office/word/2018/wordml/cex" xmlns:w16cid="http://schemas.microsoft.com/office/word/2016/wordml/cid" xmlns:w16="http://schemas.microsoft.com/office/word/2018/wordml" xmlns:w16sdtdh="http://schemas.microsoft.com/office/word/2020/wordml/sdtdatahash" xmlns:w16se="http://schemas.microsoft.com/office/word/2015/wordml/symex" mc:Ignorable="w14 w15 w16se w16cid w16 w16cex w16sdtdh">
+<w:styles xmlns:mc="http://schemas.openxmlformats.org/markup-compatibility/2006" xmlns:r="http://schemas.openxmlformats.org/officeDocument/2006/relationships" xmlns:w="http://schemas.openxmlformats.org/wordprocessingml/2006/main" xmlns:w14="http://schemas.microsoft.com/office/word/2010/wordml" xmlns:w15="http://schemas.microsoft.com/office/word/2012/wordml" xmlns:w16cex="http://schemas.microsoft.com/office/word/2018/wordml/cex" xmlns:w16cid="http://schemas.microsoft.com/office/word/2016/wordml/cid" xmlns:w16="http://schemas.microsoft.com/office/word/2018/wordml" xmlns:w16du="http://schemas.microsoft.com/office/word/2023/wordml/word16du" xmlns:w16sdtdh="http://schemas.microsoft.com/office/word/2020/wordml/sdtdatahash" xmlns:w16sdtfl="http://schemas.microsoft.com/office/word/2024/wordml/sdtformatlock" xmlns:w16se="http://schemas.microsoft.com/office/word/2015/wordml/symex" mc:Ignorable="w14 w15 w16se w16cid w16 w16cex w16sdtdh w16sdtfl w16du">
   <w:docDefaults>
     <w:rPrDefault>
       <w:rPr>

</xml_diff>